<commit_message>
Improve CV publication formatting
</commit_message>
<xml_diff>
--- a/HZHOU-CV-Jan24th2026.docx
+++ b/HZHOU-CV-Jan24th2026.docx
@@ -675,12 +675,87 @@
       <w:r>
         <w:rPr>
           <w:rFonts w:ascii="Calibri" w:hAnsi="Calibri"/>
+          <w:b/>
+          <w:i w:val="0"/>
+          <w:color w:val="17212B"/>
+          <w:sz w:val="18"/>
+        </w:rPr>
+        <w:t>Zhou H*</w:t>
+      </w:r>
+      <w:r>
+        <w:rPr>
+          <w:rFonts w:ascii="Calibri" w:hAnsi="Calibri"/>
           <w:b w:val="0"/>
           <w:i w:val="0"/>
           <w:color w:val="17212B"/>
           <w:sz w:val="18"/>
         </w:rPr>
-        <w:t>Zhou H*, Li Z*, Shyr D, Li X, Yang H, Dey R, Tang Y, Maier R, Boerwinkle E, Buyske S, Daly M, Felsenfeld A, Gibbs RA, Gupta N, Hall IM, Matise T, Metcalf GA, Smith A, Reeves C, Sofia HJ, Stitziel NO, Zody MC, NHGRI Genome Sequencing Program Consortium, Neale B, Lin X. Comparison of variant callers using 60,532 multi-ancestry whole genome sequences. Brief Bioinform. 2026;27(2):bbag130. doi: 10.1093/bib/bbag130. PMID: 41894165.</w:t>
+        <w:t xml:space="preserve">, Li Z*, Shyr D, Li X, Yang H, Dey R, Tang Y, Maier R, Boerwinkle E, Buyske S, Daly M, Felsenfeld A, Gibbs RA, Gupta N, Hall IM, Matise T, Metcalf GA, Smith A, Reeves C, Sofia HJ, Stitziel NO, Zody MC, NHGRI Genome Sequencing Program Consortium, Neale B, Lin X. </w:t>
+      </w:r>
+      <w:r>
+        <w:rPr>
+          <w:rFonts w:ascii="Calibri" w:hAnsi="Calibri"/>
+          <w:b/>
+          <w:i w:val="0"/>
+          <w:color w:val="17212B"/>
+          <w:sz w:val="18"/>
+        </w:rPr>
+        <w:t>Comparison of variant callers using 60,532 multi-ancestry whole genome sequences</w:t>
+      </w:r>
+      <w:r>
+        <w:rPr>
+          <w:rFonts w:ascii="Calibri" w:hAnsi="Calibri"/>
+          <w:b w:val="0"/>
+          <w:i w:val="0"/>
+          <w:color w:val="17212B"/>
+          <w:sz w:val="18"/>
+        </w:rPr>
+        <w:t>. Brief Bioinform. 2026;27(2):bbag130. doi: 10.1093/bib/bbag130. PMID: 41894165.</w:t>
+      </w:r>
+    </w:p>
+    <w:p>
+      <w:pPr>
+        <w:pStyle w:val="Publication"/>
+      </w:pPr>
+      <w:r>
+        <w:rPr>
+          <w:rFonts w:ascii="Calibri" w:hAnsi="Calibri"/>
+          <w:b/>
+          <w:i w:val="0"/>
+          <w:color w:val="17212B"/>
+          <w:sz w:val="18"/>
+        </w:rPr>
+        <w:t>Zhou H</w:t>
+      </w:r>
+      <w:r>
+        <w:rPr>
+          <w:rFonts w:ascii="Calibri" w:hAnsi="Calibri"/>
+          <w:b w:val="0"/>
+          <w:i w:val="0"/>
+          <w:color w:val="17212B"/>
+          <w:sz w:val="18"/>
+        </w:rPr>
+        <w:t xml:space="preserve">, Verma V, Li X, Li Z, Shedd N, Li TC, Yang H, Zhang A, Borsari B, Buyske S, Gerstein M, Matise T, Zody MC, Neale B, Weng Z, Sunyaev SR, Lin X. </w:t>
+      </w:r>
+      <w:r>
+        <w:rPr>
+          <w:rFonts w:ascii="Calibri" w:hAnsi="Calibri"/>
+          <w:b/>
+          <w:i w:val="0"/>
+          <w:color w:val="17212B"/>
+          <w:sz w:val="18"/>
+        </w:rPr>
+        <w:t>FAVOR 2.0: A reengineered functional annotation of variants online resource for interpreting genomic variation</w:t>
+      </w:r>
+      <w:r>
+        <w:rPr>
+          <w:rFonts w:ascii="Calibri" w:hAnsi="Calibri"/>
+          <w:b w:val="0"/>
+          <w:i w:val="0"/>
+          <w:color w:val="17212B"/>
+          <w:sz w:val="18"/>
+        </w:rPr>
+        <w:t>. Nucleic Acids Res. 2026;54(D1):D1405-D1414. doi: 10.1093/nar/gkaf1217. PMID: 41335103; PMCID: PMC12807660.</w:t>
       </w:r>
     </w:p>
     <w:p>
@@ -695,7 +770,47 @@
           <w:color w:val="17212B"/>
           <w:sz w:val="18"/>
         </w:rPr>
-        <w:t>Zhou H, Verma V, Li X, Li Z, Shedd N, Li TC, Yang H, Zhang A, Borsari B, Buyske S, Gerstein M, Matise T, Zody MC, Neale B, Weng Z, Sunyaev SR, Lin X. FAVOR 2.0: A reengineered functional annotation of variants online resource for interpreting genomic variation. Nucleic Acids Res. 2026;54(D1):D1405-D1414. doi: 10.1093/nar/gkaf1217. PMID: 41335103; PMCID: PMC12807660.</w:t>
+        <w:t xml:space="preserve">Van Buren E, Zhang Y, Li X, Selvaraj MS, Li Z, </w:t>
+      </w:r>
+      <w:r>
+        <w:rPr>
+          <w:rFonts w:ascii="Calibri" w:hAnsi="Calibri"/>
+          <w:b/>
+          <w:i w:val="0"/>
+          <w:color w:val="17212B"/>
+          <w:sz w:val="18"/>
+        </w:rPr>
+        <w:t>Zhou H</w:t>
+      </w:r>
+      <w:r>
+        <w:rPr>
+          <w:rFonts w:ascii="Calibri" w:hAnsi="Calibri"/>
+          <w:b w:val="0"/>
+          <w:i w:val="0"/>
+          <w:color w:val="17212B"/>
+          <w:sz w:val="18"/>
+        </w:rPr>
+        <w:t xml:space="preserve">, et al. </w:t>
+      </w:r>
+      <w:r>
+        <w:rPr>
+          <w:rFonts w:ascii="Calibri" w:hAnsi="Calibri"/>
+          <w:b/>
+          <w:i w:val="0"/>
+          <w:color w:val="17212B"/>
+          <w:sz w:val="18"/>
+        </w:rPr>
+        <w:t>cellSTAAR: incorporating single-cell-sequencing-based functional data to boost power in rare variant association testing of noncoding regions</w:t>
+      </w:r>
+      <w:r>
+        <w:rPr>
+          <w:rFonts w:ascii="Calibri" w:hAnsi="Calibri"/>
+          <w:b w:val="0"/>
+          <w:i w:val="0"/>
+          <w:color w:val="17212B"/>
+          <w:sz w:val="18"/>
+        </w:rPr>
+        <w:t>. Nat Methods. 2026;23(2):338-349. doi: 10.1038/s41592-025-02919-5.</w:t>
       </w:r>
     </w:p>
     <w:p>
@@ -710,7 +825,47 @@
           <w:color w:val="17212B"/>
           <w:sz w:val="18"/>
         </w:rPr>
-        <w:t>Van Buren E, Zhang Y, Li X, Selvaraj MS, Li Z, Zhou H, et al. cellSTAAR: incorporating single-cell-sequencing-based functional data to boost power in rare variant association testing of noncoding regions. Nat Methods. 2026;23(2):338-349. doi: 10.1038/s41592-025-02919-5.</w:t>
+        <w:t xml:space="preserve">Song S, Li X, </w:t>
+      </w:r>
+      <w:r>
+        <w:rPr>
+          <w:rFonts w:ascii="Calibri" w:hAnsi="Calibri"/>
+          <w:b/>
+          <w:i w:val="0"/>
+          <w:color w:val="17212B"/>
+          <w:sz w:val="18"/>
+        </w:rPr>
+        <w:t>Zhou H</w:t>
+      </w:r>
+      <w:r>
+        <w:rPr>
+          <w:rFonts w:ascii="Calibri" w:hAnsi="Calibri"/>
+          <w:b w:val="0"/>
+          <w:i w:val="0"/>
+          <w:color w:val="17212B"/>
+          <w:sz w:val="18"/>
+        </w:rPr>
+        <w:t xml:space="preserve">, Li Z, Lin X. </w:t>
+      </w:r>
+      <w:r>
+        <w:rPr>
+          <w:rFonts w:ascii="Calibri" w:hAnsi="Calibri"/>
+          <w:b/>
+          <w:i w:val="0"/>
+          <w:color w:val="17212B"/>
+          <w:sz w:val="18"/>
+        </w:rPr>
+        <w:t>Scalable and accurate rare-variant association tests for whole genome sequencing time-to-event analysis in large biobanks</w:t>
+      </w:r>
+      <w:r>
+        <w:rPr>
+          <w:rFonts w:ascii="Calibri" w:hAnsi="Calibri"/>
+          <w:b w:val="0"/>
+          <w:i w:val="0"/>
+          <w:color w:val="17212B"/>
+          <w:sz w:val="18"/>
+        </w:rPr>
+        <w:t>. Proc Natl Acad Sci U S A. 2026;123(9):e2525288123. doi: 10.1073/pnas.2525288123.</w:t>
       </w:r>
     </w:p>
     <w:p>
@@ -725,7 +880,47 @@
           <w:color w:val="17212B"/>
           <w:sz w:val="18"/>
         </w:rPr>
-        <w:t>Song S, Li X, Zhou H, Li Z, Lin X. Scalable and accurate rare-variant association tests for whole genome sequencing time-to-event analysis in large biobanks. Proc Natl Acad Sci U S A. 2026;123(9):e2525288123. doi: 10.1073/pnas.2525288123.</w:t>
+        <w:t xml:space="preserve">Li X, Chen H, Selvaraj MS, Van Buren E, </w:t>
+      </w:r>
+      <w:r>
+        <w:rPr>
+          <w:rFonts w:ascii="Calibri" w:hAnsi="Calibri"/>
+          <w:b/>
+          <w:i w:val="0"/>
+          <w:color w:val="17212B"/>
+          <w:sz w:val="18"/>
+        </w:rPr>
+        <w:t>Zhou H</w:t>
+      </w:r>
+      <w:r>
+        <w:rPr>
+          <w:rFonts w:ascii="Calibri" w:hAnsi="Calibri"/>
+          <w:b w:val="0"/>
+          <w:i w:val="0"/>
+          <w:color w:val="17212B"/>
+          <w:sz w:val="18"/>
+        </w:rPr>
+        <w:t xml:space="preserve">, Wang Y, Sun R, et al. </w:t>
+      </w:r>
+      <w:r>
+        <w:rPr>
+          <w:rFonts w:ascii="Calibri" w:hAnsi="Calibri"/>
+          <w:b/>
+          <w:i w:val="0"/>
+          <w:color w:val="17212B"/>
+          <w:sz w:val="18"/>
+        </w:rPr>
+        <w:t>A statistical framework for multi-trait rare variant analysis in large-scale whole-genome sequencing studies</w:t>
+      </w:r>
+      <w:r>
+        <w:rPr>
+          <w:rFonts w:ascii="Calibri" w:hAnsi="Calibri"/>
+          <w:b w:val="0"/>
+          <w:i w:val="0"/>
+          <w:color w:val="17212B"/>
+          <w:sz w:val="18"/>
+        </w:rPr>
+        <w:t>. Nat Comput Sci. 2025;5(2):125-143. doi: 10.1038/s43588-024-00764-8.</w:t>
       </w:r>
     </w:p>
     <w:p>
@@ -740,7 +935,27 @@
           <w:color w:val="17212B"/>
           <w:sz w:val="18"/>
         </w:rPr>
-        <w:t>Li X, Chen H, Selvaraj MS, Van Buren E, Zhou H, Wang Y, Sun R, et al. A statistical framework for multi-trait rare variant analysis in large-scale whole-genome sequencing studies. Nat Comput Sci. 2025;5(2):125-143. doi: 10.1038/s43588-024-00764-8.</w:t>
+        <w:t xml:space="preserve">IGVF Consortium. </w:t>
+      </w:r>
+      <w:r>
+        <w:rPr>
+          <w:rFonts w:ascii="Calibri" w:hAnsi="Calibri"/>
+          <w:b/>
+          <w:i w:val="0"/>
+          <w:color w:val="17212B"/>
+          <w:sz w:val="18"/>
+        </w:rPr>
+        <w:t>Deciphering the impact of genomic variation on function</w:t>
+      </w:r>
+      <w:r>
+        <w:rPr>
+          <w:rFonts w:ascii="Calibri" w:hAnsi="Calibri"/>
+          <w:b w:val="0"/>
+          <w:i w:val="0"/>
+          <w:color w:val="17212B"/>
+          <w:sz w:val="18"/>
+        </w:rPr>
+        <w:t>. Nature. 2024;633(8028):47-57. doi: 10.1038/s41586-024-07510-0.</w:t>
       </w:r>
     </w:p>
     <w:p>
@@ -755,7 +970,92 @@
           <w:color w:val="17212B"/>
           <w:sz w:val="18"/>
         </w:rPr>
-        <w:t>IGVF Consortium. Deciphering the impact of genomic variation on function. Nature. 2024;633(8028):47-57. doi: 10.1038/s41586-024-07510-0.</w:t>
+        <w:t xml:space="preserve">Li TC, </w:t>
+      </w:r>
+      <w:r>
+        <w:rPr>
+          <w:rFonts w:ascii="Calibri" w:hAnsi="Calibri"/>
+          <w:b/>
+          <w:i w:val="0"/>
+          <w:color w:val="17212B"/>
+          <w:sz w:val="18"/>
+        </w:rPr>
+        <w:t>Zhou H</w:t>
+      </w:r>
+      <w:r>
+        <w:rPr>
+          <w:rFonts w:ascii="Calibri" w:hAnsi="Calibri"/>
+          <w:b w:val="0"/>
+          <w:i w:val="0"/>
+          <w:color w:val="17212B"/>
+          <w:sz w:val="18"/>
+        </w:rPr>
+        <w:t xml:space="preserve">, Verma V, Tang X, Shao Y, Van Buren E, Weng Z, Gerstein M, Neale B, Sunyaev SR, Lin X. </w:t>
+      </w:r>
+      <w:r>
+        <w:rPr>
+          <w:rFonts w:ascii="Calibri" w:hAnsi="Calibri"/>
+          <w:b/>
+          <w:i w:val="0"/>
+          <w:color w:val="17212B"/>
+          <w:sz w:val="18"/>
+        </w:rPr>
+        <w:t>FAVOR-GPT: a generative natural language interface to whole genome variant functional annotations</w:t>
+      </w:r>
+      <w:r>
+        <w:rPr>
+          <w:rFonts w:ascii="Calibri" w:hAnsi="Calibri"/>
+          <w:b w:val="0"/>
+          <w:i w:val="0"/>
+          <w:color w:val="17212B"/>
+          <w:sz w:val="18"/>
+        </w:rPr>
+        <w:t>. Bioinform Adv. 2024;4(1):vbae143. doi: 10.1093/bioadv/vbae143.</w:t>
+      </w:r>
+    </w:p>
+    <w:p>
+      <w:pPr>
+        <w:pStyle w:val="Publication"/>
+      </w:pPr>
+      <w:r>
+        <w:rPr>
+          <w:rFonts w:ascii="Calibri" w:hAnsi="Calibri"/>
+          <w:b/>
+          <w:i w:val="0"/>
+          <w:color w:val="17212B"/>
+          <w:sz w:val="18"/>
+        </w:rPr>
+        <w:t>Zhou H</w:t>
+      </w:r>
+      <w:r>
+        <w:rPr>
+          <w:rFonts w:ascii="Calibri" w:hAnsi="Calibri"/>
+          <w:b w:val="0"/>
+          <w:i w:val="0"/>
+          <w:color w:val="17212B"/>
+          <w:sz w:val="18"/>
+        </w:rPr>
+        <w:t xml:space="preserve">, Arapoglou T, Li X, Li Z, Zheng X, Moore JE, Asok A, Kumar S, Blue EE, Buyske S, Cox N, et al. </w:t>
+      </w:r>
+      <w:r>
+        <w:rPr>
+          <w:rFonts w:ascii="Calibri" w:hAnsi="Calibri"/>
+          <w:b/>
+          <w:i w:val="0"/>
+          <w:color w:val="17212B"/>
+          <w:sz w:val="18"/>
+        </w:rPr>
+        <w:t>FAVOR: functional annotation of variants online resource and annotator for variation across the human genome</w:t>
+      </w:r>
+      <w:r>
+        <w:rPr>
+          <w:rFonts w:ascii="Calibri" w:hAnsi="Calibri"/>
+          <w:b w:val="0"/>
+          <w:i w:val="0"/>
+          <w:color w:val="17212B"/>
+          <w:sz w:val="18"/>
+        </w:rPr>
+        <w:t>. Nucleic Acids Res. 2023;51(D1):D1300-D1311. doi: 10.1093/nar/gkac966.</w:t>
       </w:r>
     </w:p>
     <w:p>
@@ -770,7 +1070,47 @@
           <w:color w:val="17212B"/>
           <w:sz w:val="18"/>
         </w:rPr>
-        <w:t>Li TC, Zhou H, Verma V, Tang X, Shao Y, Van Buren E, Weng Z, Gerstein M, Neale B, Sunyaev SR, Lin X. FAVOR-GPT: a generative natural language interface to whole genome variant functional annotations. Bioinform Adv. 2024;4(1):vbae143. doi: 10.1093/bioadv/vbae143.</w:t>
+        <w:t xml:space="preserve">Li X, Quick C, </w:t>
+      </w:r>
+      <w:r>
+        <w:rPr>
+          <w:rFonts w:ascii="Calibri" w:hAnsi="Calibri"/>
+          <w:b/>
+          <w:i w:val="0"/>
+          <w:color w:val="17212B"/>
+          <w:sz w:val="18"/>
+        </w:rPr>
+        <w:t>Zhou H</w:t>
+      </w:r>
+      <w:r>
+        <w:rPr>
+          <w:rFonts w:ascii="Calibri" w:hAnsi="Calibri"/>
+          <w:b w:val="0"/>
+          <w:i w:val="0"/>
+          <w:color w:val="17212B"/>
+          <w:sz w:val="18"/>
+        </w:rPr>
+        <w:t xml:space="preserve">, Gaynor SM, Liu Y, Chen H, Selvaraj MS, Sun R, Dey R, et al. </w:t>
+      </w:r>
+      <w:r>
+        <w:rPr>
+          <w:rFonts w:ascii="Calibri" w:hAnsi="Calibri"/>
+          <w:b/>
+          <w:i w:val="0"/>
+          <w:color w:val="17212B"/>
+          <w:sz w:val="18"/>
+        </w:rPr>
+        <w:t>Powerful, scalable and resource-efficient meta-analysis of rare variant associations in large whole genome sequencing studies</w:t>
+      </w:r>
+      <w:r>
+        <w:rPr>
+          <w:rFonts w:ascii="Calibri" w:hAnsi="Calibri"/>
+          <w:b w:val="0"/>
+          <w:i w:val="0"/>
+          <w:color w:val="17212B"/>
+          <w:sz w:val="18"/>
+        </w:rPr>
+        <w:t>. Nat Genet. 2023;55(1):154-164. doi: 10.1038/s41588-022-01225-6.</w:t>
       </w:r>
     </w:p>
     <w:p>
@@ -785,7 +1125,47 @@
           <w:color w:val="17212B"/>
           <w:sz w:val="18"/>
         </w:rPr>
-        <w:t>Zhou H, Arapoglou T, Li X, Li Z, Zheng X, Moore JE, Asok A, Kumar S, Blue EE, Buyske S, Cox N, et al. FAVOR: functional annotation of variants online resource and annotator for variation across the human genome. Nucleic Acids Res. 2023;51(D1):D1300-D1311. doi: 10.1093/nar/gkac966.</w:t>
+        <w:t xml:space="preserve">Li Z, Li X, </w:t>
+      </w:r>
+      <w:r>
+        <w:rPr>
+          <w:rFonts w:ascii="Calibri" w:hAnsi="Calibri"/>
+          <w:b/>
+          <w:i w:val="0"/>
+          <w:color w:val="17212B"/>
+          <w:sz w:val="18"/>
+        </w:rPr>
+        <w:t>Zhou H</w:t>
+      </w:r>
+      <w:r>
+        <w:rPr>
+          <w:rFonts w:ascii="Calibri" w:hAnsi="Calibri"/>
+          <w:b w:val="0"/>
+          <w:i w:val="0"/>
+          <w:color w:val="17212B"/>
+          <w:sz w:val="18"/>
+        </w:rPr>
+        <w:t xml:space="preserve">, Gaynor SM, Selvaraj MS, Arapoglou T, Quick C, Liu Y, Chen H, Sun R, Dey R, et al. </w:t>
+      </w:r>
+      <w:r>
+        <w:rPr>
+          <w:rFonts w:ascii="Calibri" w:hAnsi="Calibri"/>
+          <w:b/>
+          <w:i w:val="0"/>
+          <w:color w:val="17212B"/>
+          <w:sz w:val="18"/>
+        </w:rPr>
+        <w:t>A framework for detecting noncoding rare-variant associations of large-scale whole-genome sequencing studies</w:t>
+      </w:r>
+      <w:r>
+        <w:rPr>
+          <w:rFonts w:ascii="Calibri" w:hAnsi="Calibri"/>
+          <w:b w:val="0"/>
+          <w:i w:val="0"/>
+          <w:color w:val="17212B"/>
+          <w:sz w:val="18"/>
+        </w:rPr>
+        <w:t>. Nat Methods. 2022;19:1599-1611. doi: 10.1038/s41592-022-01640-x.</w:t>
       </w:r>
     </w:p>
     <w:p>
@@ -800,7 +1180,47 @@
           <w:color w:val="17212B"/>
           <w:sz w:val="18"/>
         </w:rPr>
-        <w:t>Li X, Quick C, Zhou H, Gaynor SM, Liu Y, Chen H, Selvaraj MS, Sun R, Dey R, et al. Powerful, scalable and resource-efficient meta-analysis of rare variant associations in large whole genome sequencing studies. Nat Genet. 2023;55(1):154-164. doi: 10.1038/s41588-022-01225-6.</w:t>
+        <w:t xml:space="preserve">Li X, Yung G, </w:t>
+      </w:r>
+      <w:r>
+        <w:rPr>
+          <w:rFonts w:ascii="Calibri" w:hAnsi="Calibri"/>
+          <w:b/>
+          <w:i w:val="0"/>
+          <w:color w:val="17212B"/>
+          <w:sz w:val="18"/>
+        </w:rPr>
+        <w:t>Zhou H</w:t>
+      </w:r>
+      <w:r>
+        <w:rPr>
+          <w:rFonts w:ascii="Calibri" w:hAnsi="Calibri"/>
+          <w:b w:val="0"/>
+          <w:i w:val="0"/>
+          <w:color w:val="17212B"/>
+          <w:sz w:val="18"/>
+        </w:rPr>
+        <w:t xml:space="preserve">, Sun R, Li Z, Hou K, Zhang MJ, Liu Y, Arapoglou T, Wang C, Ionita-Laza I, Lin X. </w:t>
+      </w:r>
+      <w:r>
+        <w:rPr>
+          <w:rFonts w:ascii="Calibri" w:hAnsi="Calibri"/>
+          <w:b/>
+          <w:i w:val="0"/>
+          <w:color w:val="17212B"/>
+          <w:sz w:val="18"/>
+        </w:rPr>
+        <w:t>A multi-dimensional integrative scoring framework for predicting functional variants in the human genome</w:t>
+      </w:r>
+      <w:r>
+        <w:rPr>
+          <w:rFonts w:ascii="Calibri" w:hAnsi="Calibri"/>
+          <w:b w:val="0"/>
+          <w:i w:val="0"/>
+          <w:color w:val="17212B"/>
+          <w:sz w:val="18"/>
+        </w:rPr>
+        <w:t>. Am J Hum Genet. 2022;109(3):446-456.</w:t>
       </w:r>
     </w:p>
     <w:p>
@@ -815,7 +1235,47 @@
           <w:color w:val="17212B"/>
           <w:sz w:val="18"/>
         </w:rPr>
-        <w:t>Li Z, Li X, Zhou H, Gaynor SM, Selvaraj MS, Arapoglou T, Quick C, Liu Y, Chen H, Sun R, Dey R, et al. A framework for detecting noncoding rare-variant associations of large-scale whole-genome sequencing studies. Nat Methods. 2022;19:1599-1611. doi: 10.1038/s41592-022-01640-x.</w:t>
+        <w:t xml:space="preserve">Li X, Li Z, </w:t>
+      </w:r>
+      <w:r>
+        <w:rPr>
+          <w:rFonts w:ascii="Calibri" w:hAnsi="Calibri"/>
+          <w:b/>
+          <w:i w:val="0"/>
+          <w:color w:val="17212B"/>
+          <w:sz w:val="18"/>
+        </w:rPr>
+        <w:t>Zhou H</w:t>
+      </w:r>
+      <w:r>
+        <w:rPr>
+          <w:rFonts w:ascii="Calibri" w:hAnsi="Calibri"/>
+          <w:b w:val="0"/>
+          <w:i w:val="0"/>
+          <w:color w:val="17212B"/>
+          <w:sz w:val="18"/>
+        </w:rPr>
+        <w:t xml:space="preserve">, Gaynor SM, Liu Y, Chen H, Sun R, et al. </w:t>
+      </w:r>
+      <w:r>
+        <w:rPr>
+          <w:rFonts w:ascii="Calibri" w:hAnsi="Calibri"/>
+          <w:b/>
+          <w:i w:val="0"/>
+          <w:color w:val="17212B"/>
+          <w:sz w:val="18"/>
+        </w:rPr>
+        <w:t>Dynamic incorporation of multiple in silico functional annotations empowers rare variant association analysis of large whole-genome sequencing studies at scale</w:t>
+      </w:r>
+      <w:r>
+        <w:rPr>
+          <w:rFonts w:ascii="Calibri" w:hAnsi="Calibri"/>
+          <w:b w:val="0"/>
+          <w:i w:val="0"/>
+          <w:color w:val="17212B"/>
+          <w:sz w:val="18"/>
+        </w:rPr>
+        <w:t>. Nat Genet. 2020;52(9):969-983.</w:t>
       </w:r>
     </w:p>
     <w:p>
@@ -830,7 +1290,92 @@
           <w:color w:val="17212B"/>
           <w:sz w:val="18"/>
         </w:rPr>
-        <w:t>Li X, Yung G, Zhou H, Sun R, Li Z, Hou K, Zhang MJ, Liu Y, Arapoglou T, Wang C, Ionita-Laza I, Lin X. A multi-dimensional integrative scoring framework for predicting functional variants in the human genome. Am J Hum Genet. 2022;109(3):446-456.</w:t>
+        <w:t xml:space="preserve">Jiang S, </w:t>
+      </w:r>
+      <w:r>
+        <w:rPr>
+          <w:rFonts w:ascii="Calibri" w:hAnsi="Calibri"/>
+          <w:b/>
+          <w:i w:val="0"/>
+          <w:color w:val="17212B"/>
+          <w:sz w:val="18"/>
+        </w:rPr>
+        <w:t>Zhou H*</w:t>
+      </w:r>
+      <w:r>
+        <w:rPr>
+          <w:rFonts w:ascii="Calibri" w:hAnsi="Calibri"/>
+          <w:b w:val="0"/>
+          <w:i w:val="0"/>
+          <w:color w:val="17212B"/>
+          <w:sz w:val="18"/>
+        </w:rPr>
+        <w:t xml:space="preserve">, Liang J, Gerdt C, Wang C, Ke L, Schmidt SC, Narita Y, Ma Y, Wang S, Colson T, et al. </w:t>
+      </w:r>
+      <w:r>
+        <w:rPr>
+          <w:rFonts w:ascii="Calibri" w:hAnsi="Calibri"/>
+          <w:b/>
+          <w:i w:val="0"/>
+          <w:color w:val="17212B"/>
+          <w:sz w:val="18"/>
+        </w:rPr>
+        <w:t>The Epstein-Barr virus regulome in lymphoblastoid cells</w:t>
+      </w:r>
+      <w:r>
+        <w:rPr>
+          <w:rFonts w:ascii="Calibri" w:hAnsi="Calibri"/>
+          <w:b w:val="0"/>
+          <w:i w:val="0"/>
+          <w:color w:val="17212B"/>
+          <w:sz w:val="18"/>
+        </w:rPr>
+        <w:t>. Cell Host Microbe. 2017;22(4):561-573.</w:t>
+      </w:r>
+    </w:p>
+    <w:p>
+      <w:pPr>
+        <w:pStyle w:val="Publication"/>
+      </w:pPr>
+      <w:r>
+        <w:rPr>
+          <w:rFonts w:ascii="Calibri" w:hAnsi="Calibri"/>
+          <w:b/>
+          <w:i w:val="0"/>
+          <w:color w:val="17212B"/>
+          <w:sz w:val="18"/>
+        </w:rPr>
+        <w:t>Zhou H</w:t>
+      </w:r>
+      <w:r>
+        <w:rPr>
+          <w:rFonts w:ascii="Calibri" w:hAnsi="Calibri"/>
+          <w:b w:val="0"/>
+          <w:i w:val="0"/>
+          <w:color w:val="17212B"/>
+          <w:sz w:val="18"/>
+        </w:rPr>
+        <w:t xml:space="preserve">, Schmidt SC, Jiang S, Willox B, Bernhardt K, Liang J, Johannsen EC, Kharchenko P, Gewurz BE, Kieff E, Zhao B. </w:t>
+      </w:r>
+      <w:r>
+        <w:rPr>
+          <w:rFonts w:ascii="Calibri" w:hAnsi="Calibri"/>
+          <w:b/>
+          <w:i w:val="0"/>
+          <w:color w:val="17212B"/>
+          <w:sz w:val="18"/>
+        </w:rPr>
+        <w:t>Epstein-Barr virus oncoprotein super-enhancers control B cell growth</w:t>
+      </w:r>
+      <w:r>
+        <w:rPr>
+          <w:rFonts w:ascii="Calibri" w:hAnsi="Calibri"/>
+          <w:b w:val="0"/>
+          <w:i w:val="0"/>
+          <w:color w:val="17212B"/>
+          <w:sz w:val="18"/>
+        </w:rPr>
+        <w:t>. Cell Host Microbe. 2015;17(2):205-216.</w:t>
       </w:r>
     </w:p>
     <w:p>
@@ -845,13 +1390,18 @@
           <w:color w:val="17212B"/>
           <w:sz w:val="18"/>
         </w:rPr>
-        <w:t>Li X, Li Z, Zhou H, Gaynor SM, Liu Y, Chen H, Sun R, et al. Dynamic incorporation of multiple in silico functional annotations empowers rare variant association analysis of large whole-genome sequencing studies at scale. Nat Genet. 2020;52(9):969-983.</w:t>
+        <w:t xml:space="preserve">Portal D*, </w:t>
       </w:r>
-    </w:p>
-    <w:p>
-      <w:pPr>
-        <w:pStyle w:val="Publication"/>
-      </w:pPr>
+      <w:r>
+        <w:rPr>
+          <w:rFonts w:ascii="Calibri" w:hAnsi="Calibri"/>
+          <w:b/>
+          <w:i w:val="0"/>
+          <w:color w:val="17212B"/>
+          <w:sz w:val="18"/>
+        </w:rPr>
+        <w:t>Zhou H*</w:t>
+      </w:r>
       <w:r>
         <w:rPr>
           <w:rFonts w:ascii="Calibri" w:hAnsi="Calibri"/>
@@ -860,13 +1410,18 @@
           <w:color w:val="17212B"/>
           <w:sz w:val="18"/>
         </w:rPr>
-        <w:t>Jiang S, Zhou H*, Liang J, Gerdt C, Wang C, Ke L, Schmidt SC, Narita Y, Ma Y, Wang S, Colson T, et al. The Epstein-Barr virus regulome in lymphoblastoid cells. Cell Host Microbe. 2017;22(4):561-573.</w:t>
+        <w:t xml:space="preserve">, Zhao B, Kharchenko PV, Lowry E, Wong L, Quackenbush J, Holloway D, Jiang S, Lu Y, Kieff E. </w:t>
       </w:r>
-    </w:p>
-    <w:p>
-      <w:pPr>
-        <w:pStyle w:val="Publication"/>
-      </w:pPr>
+      <w:r>
+        <w:rPr>
+          <w:rFonts w:ascii="Calibri" w:hAnsi="Calibri"/>
+          <w:b/>
+          <w:i w:val="0"/>
+          <w:color w:val="17212B"/>
+          <w:sz w:val="18"/>
+        </w:rPr>
+        <w:t>Epstein-Barr virus nuclear antigen leader protein localizes to promoters and enhancers with cell transcription factors and EBNA2</w:t>
+      </w:r>
       <w:r>
         <w:rPr>
           <w:rFonts w:ascii="Calibri" w:hAnsi="Calibri"/>
@@ -875,22 +1430,7 @@
           <w:color w:val="17212B"/>
           <w:sz w:val="18"/>
         </w:rPr>
-        <w:t>Zhou H, Schmidt SC, Jiang S, Willox B, Bernhardt K, Liang J, Johannsen EC, Kharchenko P, Gewurz BE, Kieff E, Zhao B. Epstein-Barr virus oncoprotein super-enhancers control B cell growth. Cell Host Microbe. 2015;17(2):205-216.</w:t>
-      </w:r>
-    </w:p>
-    <w:p>
-      <w:pPr>
-        <w:pStyle w:val="Publication"/>
-      </w:pPr>
-      <w:r>
-        <w:rPr>
-          <w:rFonts w:ascii="Calibri" w:hAnsi="Calibri"/>
-          <w:b w:val="0"/>
-          <w:i w:val="0"/>
-          <w:color w:val="17212B"/>
-          <w:sz w:val="18"/>
-        </w:rPr>
-        <w:t>Portal D*, Zhou H*, Zhao B, Kharchenko PV, Lowry E, Wong L, Quackenbush J, Holloway D, Jiang S, Lu Y, Kieff E. Epstein-Barr virus nuclear antigen leader protein localizes to promoters and enhancers with cell transcription factors and EBNA2. Proc Natl Acad Sci U S A. 2013;110(46):18537-18542. doi: 10.1073/pnas.1317608110.</w:t>
+        <w:t>. Proc Natl Acad Sci U S A. 2013;110(46):18537-18542. doi: 10.1073/pnas.1317608110.</w:t>
       </w:r>
     </w:p>
     <w:p>
@@ -919,7 +1459,47 @@
           <w:color w:val="17212B"/>
           <w:sz w:val="18"/>
         </w:rPr>
-        <w:t>Dong M, Thakral A, Byrne KS, Bosse Y, Zhou H, et al. Genome-wide association study of early-stage non-small cell lung cancer prognosis: a pooled analysis in the International Lung Cancer Consortium. Carcinogenesis. 2025;46(2):bgaf031.</w:t>
+        <w:t xml:space="preserve">Dong M, Thakral A, Byrne KS, Bosse Y, </w:t>
+      </w:r>
+      <w:r>
+        <w:rPr>
+          <w:rFonts w:ascii="Calibri" w:hAnsi="Calibri"/>
+          <w:b/>
+          <w:i w:val="0"/>
+          <w:color w:val="17212B"/>
+          <w:sz w:val="18"/>
+        </w:rPr>
+        <w:t>Zhou H</w:t>
+      </w:r>
+      <w:r>
+        <w:rPr>
+          <w:rFonts w:ascii="Calibri" w:hAnsi="Calibri"/>
+          <w:b w:val="0"/>
+          <w:i w:val="0"/>
+          <w:color w:val="17212B"/>
+          <w:sz w:val="18"/>
+        </w:rPr>
+        <w:t xml:space="preserve">, et al. </w:t>
+      </w:r>
+      <w:r>
+        <w:rPr>
+          <w:rFonts w:ascii="Calibri" w:hAnsi="Calibri"/>
+          <w:b/>
+          <w:i w:val="0"/>
+          <w:color w:val="17212B"/>
+          <w:sz w:val="18"/>
+        </w:rPr>
+        <w:t>Genome-wide association study of early-stage non-small cell lung cancer prognosis: a pooled analysis in the International Lung Cancer Consortium</w:t>
+      </w:r>
+      <w:r>
+        <w:rPr>
+          <w:rFonts w:ascii="Calibri" w:hAnsi="Calibri"/>
+          <w:b w:val="0"/>
+          <w:i w:val="0"/>
+          <w:color w:val="17212B"/>
+          <w:sz w:val="18"/>
+        </w:rPr>
+        <w:t>. Carcinogenesis. 2025;46(2):bgaf031.</w:t>
       </w:r>
     </w:p>
     <w:p>
@@ -934,7 +1514,47 @@
           <w:color w:val="17212B"/>
           <w:sz w:val="18"/>
         </w:rPr>
-        <w:t>Hawkes G, Beaumont RN, Li Z, Mandla R, Li X, Albert CM, et al., Zhou H, et al. Whole-genome sequencing in 333,100 individuals reveals rare non-coding single variant and aggregate associations with height. Nat Commun. 2024;15(1):8549.</w:t>
+        <w:t xml:space="preserve">Hawkes G, Beaumont RN, Li Z, Mandla R, Li X, Albert CM, et al., </w:t>
+      </w:r>
+      <w:r>
+        <w:rPr>
+          <w:rFonts w:ascii="Calibri" w:hAnsi="Calibri"/>
+          <w:b/>
+          <w:i w:val="0"/>
+          <w:color w:val="17212B"/>
+          <w:sz w:val="18"/>
+        </w:rPr>
+        <w:t>Zhou H</w:t>
+      </w:r>
+      <w:r>
+        <w:rPr>
+          <w:rFonts w:ascii="Calibri" w:hAnsi="Calibri"/>
+          <w:b w:val="0"/>
+          <w:i w:val="0"/>
+          <w:color w:val="17212B"/>
+          <w:sz w:val="18"/>
+        </w:rPr>
+        <w:t xml:space="preserve">, et al. </w:t>
+      </w:r>
+      <w:r>
+        <w:rPr>
+          <w:rFonts w:ascii="Calibri" w:hAnsi="Calibri"/>
+          <w:b/>
+          <w:i w:val="0"/>
+          <w:color w:val="17212B"/>
+          <w:sz w:val="18"/>
+        </w:rPr>
+        <w:t>Whole-genome sequencing in 333,100 individuals reveals rare non-coding single variant and aggregate associations with height</w:t>
+      </w:r>
+      <w:r>
+        <w:rPr>
+          <w:rFonts w:ascii="Calibri" w:hAnsi="Calibri"/>
+          <w:b w:val="0"/>
+          <w:i w:val="0"/>
+          <w:color w:val="17212B"/>
+          <w:sz w:val="18"/>
+        </w:rPr>
+        <w:t>. Nat Commun. 2024;15(1):8549.</w:t>
       </w:r>
     </w:p>
     <w:p>
@@ -949,7 +1569,47 @@
           <w:color w:val="17212B"/>
           <w:sz w:val="18"/>
         </w:rPr>
-        <w:t>Hu T, Ji Q, Ke X, Zhou H, Zhang S, Ma S, Yu C, Ju W, Lu M, Lin Y, Ou Y, Zhou Y, Xiao Y, Xu C, Hu C. Repurposing Type I-A CRISPR-Cas3 for a robust diagnosis of human papillomavirus. Commun Biol. 2024;7(1):858.</w:t>
+        <w:t xml:space="preserve">Hu T, Ji Q, Ke X, </w:t>
+      </w:r>
+      <w:r>
+        <w:rPr>
+          <w:rFonts w:ascii="Calibri" w:hAnsi="Calibri"/>
+          <w:b/>
+          <w:i w:val="0"/>
+          <w:color w:val="17212B"/>
+          <w:sz w:val="18"/>
+        </w:rPr>
+        <w:t>Zhou H</w:t>
+      </w:r>
+      <w:r>
+        <w:rPr>
+          <w:rFonts w:ascii="Calibri" w:hAnsi="Calibri"/>
+          <w:b w:val="0"/>
+          <w:i w:val="0"/>
+          <w:color w:val="17212B"/>
+          <w:sz w:val="18"/>
+        </w:rPr>
+        <w:t xml:space="preserve">, Zhang S, Ma S, Yu C, Ju W, Lu M, Lin Y, Ou Y, Zhou Y, Xiao Y, Xu C, Hu C. </w:t>
+      </w:r>
+      <w:r>
+        <w:rPr>
+          <w:rFonts w:ascii="Calibri" w:hAnsi="Calibri"/>
+          <w:b/>
+          <w:i w:val="0"/>
+          <w:color w:val="17212B"/>
+          <w:sz w:val="18"/>
+        </w:rPr>
+        <w:t>Repurposing Type I-A CRISPR-Cas3 for a robust diagnosis of human papillomavirus</w:t>
+      </w:r>
+      <w:r>
+        <w:rPr>
+          <w:rFonts w:ascii="Calibri" w:hAnsi="Calibri"/>
+          <w:b w:val="0"/>
+          <w:i w:val="0"/>
+          <w:color w:val="17212B"/>
+          <w:sz w:val="18"/>
+        </w:rPr>
+        <w:t>. Commun Biol. 2024;7(1):858.</w:t>
       </w:r>
     </w:p>
     <w:p>
@@ -964,7 +1624,47 @@
           <w:color w:val="17212B"/>
           <w:sz w:val="18"/>
         </w:rPr>
-        <w:t>Granot-Hershkovitz E, Sun Q, Argos M, Zhou H, Lin X, Browning SR, Sofer T. AFA: ancestry-specific allele frequency estimation in admixed populations. Hum Genet Genom Adv. 2022;3(2):100096.</w:t>
+        <w:t xml:space="preserve">Granot-Hershkovitz E, Sun Q, Argos M, </w:t>
+      </w:r>
+      <w:r>
+        <w:rPr>
+          <w:rFonts w:ascii="Calibri" w:hAnsi="Calibri"/>
+          <w:b/>
+          <w:i w:val="0"/>
+          <w:color w:val="17212B"/>
+          <w:sz w:val="18"/>
+        </w:rPr>
+        <w:t>Zhou H</w:t>
+      </w:r>
+      <w:r>
+        <w:rPr>
+          <w:rFonts w:ascii="Calibri" w:hAnsi="Calibri"/>
+          <w:b w:val="0"/>
+          <w:i w:val="0"/>
+          <w:color w:val="17212B"/>
+          <w:sz w:val="18"/>
+        </w:rPr>
+        <w:t xml:space="preserve">, Lin X, Browning SR, Sofer T. </w:t>
+      </w:r>
+      <w:r>
+        <w:rPr>
+          <w:rFonts w:ascii="Calibri" w:hAnsi="Calibri"/>
+          <w:b/>
+          <w:i w:val="0"/>
+          <w:color w:val="17212B"/>
+          <w:sz w:val="18"/>
+        </w:rPr>
+        <w:t>AFA: ancestry-specific allele frequency estimation in admixed populations</w:t>
+      </w:r>
+      <w:r>
+        <w:rPr>
+          <w:rFonts w:ascii="Calibri" w:hAnsi="Calibri"/>
+          <w:b w:val="0"/>
+          <w:i w:val="0"/>
+          <w:color w:val="17212B"/>
+          <w:sz w:val="18"/>
+        </w:rPr>
+        <w:t>. Hum Genet Genom Adv. 2022;3(2):100096.</w:t>
       </w:r>
     </w:p>
     <w:p>
@@ -979,7 +1679,47 @@
           <w:color w:val="17212B"/>
           <w:sz w:val="18"/>
         </w:rPr>
-        <w:t>Sun R, Xu M, Li X, Gaynor S, Zhou H, Li Z, Bossé Y, Lam S, Tsao MS, Tardon A, Chen C. Integration of multiomic annotation data to prioritize inflammation and immune-related risk variants in squamous cell lung cancer. Genet Epidemiol. 2021;45(1):99-114.</w:t>
+        <w:t xml:space="preserve">Sun R, Xu M, Li X, Gaynor S, </w:t>
+      </w:r>
+      <w:r>
+        <w:rPr>
+          <w:rFonts w:ascii="Calibri" w:hAnsi="Calibri"/>
+          <w:b/>
+          <w:i w:val="0"/>
+          <w:color w:val="17212B"/>
+          <w:sz w:val="18"/>
+        </w:rPr>
+        <w:t>Zhou H</w:t>
+      </w:r>
+      <w:r>
+        <w:rPr>
+          <w:rFonts w:ascii="Calibri" w:hAnsi="Calibri"/>
+          <w:b w:val="0"/>
+          <w:i w:val="0"/>
+          <w:color w:val="17212B"/>
+          <w:sz w:val="18"/>
+        </w:rPr>
+        <w:t xml:space="preserve">, Li Z, Bossé Y, Lam S, Tsao MS, Tardon A, Chen C. </w:t>
+      </w:r>
+      <w:r>
+        <w:rPr>
+          <w:rFonts w:ascii="Calibri" w:hAnsi="Calibri"/>
+          <w:b/>
+          <w:i w:val="0"/>
+          <w:color w:val="17212B"/>
+          <w:sz w:val="18"/>
+        </w:rPr>
+        <w:t>Integration of multiomic annotation data to prioritize inflammation and immune-related risk variants in squamous cell lung cancer</w:t>
+      </w:r>
+      <w:r>
+        <w:rPr>
+          <w:rFonts w:ascii="Calibri" w:hAnsi="Calibri"/>
+          <w:b w:val="0"/>
+          <w:i w:val="0"/>
+          <w:color w:val="17212B"/>
+          <w:sz w:val="18"/>
+        </w:rPr>
+        <w:t>. Genet Epidemiol. 2021;45(1):99-114.</w:t>
       </w:r>
     </w:p>
     <w:p>
@@ -994,7 +1734,47 @@
           <w:color w:val="17212B"/>
           <w:sz w:val="18"/>
         </w:rPr>
-        <w:t>Wang L, Laing J, Yan B, Zhou H, Ke L, Wang C, Narita Y, Zhang Z, Olson MR, Afzali B, Zhao B. Epstein-Barr virus episome physically interacts with active regions of the host genome in lymphoblastoid cells. J Virol. 2020;94(24):e01390-20.</w:t>
+        <w:t xml:space="preserve">Wang L, Laing J, Yan B, </w:t>
+      </w:r>
+      <w:r>
+        <w:rPr>
+          <w:rFonts w:ascii="Calibri" w:hAnsi="Calibri"/>
+          <w:b/>
+          <w:i w:val="0"/>
+          <w:color w:val="17212B"/>
+          <w:sz w:val="18"/>
+        </w:rPr>
+        <w:t>Zhou H</w:t>
+      </w:r>
+      <w:r>
+        <w:rPr>
+          <w:rFonts w:ascii="Calibri" w:hAnsi="Calibri"/>
+          <w:b w:val="0"/>
+          <w:i w:val="0"/>
+          <w:color w:val="17212B"/>
+          <w:sz w:val="18"/>
+        </w:rPr>
+        <w:t xml:space="preserve">, Ke L, Wang C, Narita Y, Zhang Z, Olson MR, Afzali B, Zhao B. </w:t>
+      </w:r>
+      <w:r>
+        <w:rPr>
+          <w:rFonts w:ascii="Calibri" w:hAnsi="Calibri"/>
+          <w:b/>
+          <w:i w:val="0"/>
+          <w:color w:val="17212B"/>
+          <w:sz w:val="18"/>
+        </w:rPr>
+        <w:t>Epstein-Barr virus episome physically interacts with active regions of the host genome in lymphoblastoid cells</w:t>
+      </w:r>
+      <w:r>
+        <w:rPr>
+          <w:rFonts w:ascii="Calibri" w:hAnsi="Calibri"/>
+          <w:b w:val="0"/>
+          <w:i w:val="0"/>
+          <w:color w:val="17212B"/>
+          <w:sz w:val="18"/>
+        </w:rPr>
+        <w:t>. J Virol. 2020;94(24):e01390-20.</w:t>
       </w:r>
     </w:p>
     <w:p>
@@ -1009,7 +1789,47 @@
           <w:color w:val="17212B"/>
           <w:sz w:val="18"/>
         </w:rPr>
-        <w:t>Li Z, Li X, Liu Y, Shen J, Chen H, Zhou H, Morrison AC, Boerwinkle E, Lin X. Dynamic scan procedure for detecting rare-variant association regions in whole-genome sequencing studies. Am J Hum Genet. 2019;104(5):802-814.</w:t>
+        <w:t xml:space="preserve">Li Z, Li X, Liu Y, Shen J, Chen H, </w:t>
+      </w:r>
+      <w:r>
+        <w:rPr>
+          <w:rFonts w:ascii="Calibri" w:hAnsi="Calibri"/>
+          <w:b/>
+          <w:i w:val="0"/>
+          <w:color w:val="17212B"/>
+          <w:sz w:val="18"/>
+        </w:rPr>
+        <w:t>Zhou H</w:t>
+      </w:r>
+      <w:r>
+        <w:rPr>
+          <w:rFonts w:ascii="Calibri" w:hAnsi="Calibri"/>
+          <w:b w:val="0"/>
+          <w:i w:val="0"/>
+          <w:color w:val="17212B"/>
+          <w:sz w:val="18"/>
+        </w:rPr>
+        <w:t xml:space="preserve">, Morrison AC, Boerwinkle E, Lin X. </w:t>
+      </w:r>
+      <w:r>
+        <w:rPr>
+          <w:rFonts w:ascii="Calibri" w:hAnsi="Calibri"/>
+          <w:b/>
+          <w:i w:val="0"/>
+          <w:color w:val="17212B"/>
+          <w:sz w:val="18"/>
+        </w:rPr>
+        <w:t>Dynamic scan procedure for detecting rare-variant association regions in whole-genome sequencing studies</w:t>
+      </w:r>
+      <w:r>
+        <w:rPr>
+          <w:rFonts w:ascii="Calibri" w:hAnsi="Calibri"/>
+          <w:b w:val="0"/>
+          <w:i w:val="0"/>
+          <w:color w:val="17212B"/>
+          <w:sz w:val="18"/>
+        </w:rPr>
+        <w:t>. Am J Hum Genet. 2019;104(5):802-814.</w:t>
       </w:r>
     </w:p>
     <w:p>
@@ -1024,7 +1844,47 @@
           <w:color w:val="17212B"/>
           <w:sz w:val="18"/>
         </w:rPr>
-        <w:t>Ke L, Zhou H, Wang C, Xiong G, Xiang Y, Ling Y, Khabir A, Tsao GS, Zeng Y, Zeng M, Busson P. Nasopharyngeal carcinoma super-enhancer-driven ETV6 correlates with prognosis. Proc Natl Acad Sci U S A. 2017;114(36):9683-9688.</w:t>
+        <w:t xml:space="preserve">Ke L, </w:t>
+      </w:r>
+      <w:r>
+        <w:rPr>
+          <w:rFonts w:ascii="Calibri" w:hAnsi="Calibri"/>
+          <w:b/>
+          <w:i w:val="0"/>
+          <w:color w:val="17212B"/>
+          <w:sz w:val="18"/>
+        </w:rPr>
+        <w:t>Zhou H</w:t>
+      </w:r>
+      <w:r>
+        <w:rPr>
+          <w:rFonts w:ascii="Calibri" w:hAnsi="Calibri"/>
+          <w:b w:val="0"/>
+          <w:i w:val="0"/>
+          <w:color w:val="17212B"/>
+          <w:sz w:val="18"/>
+        </w:rPr>
+        <w:t xml:space="preserve">, Wang C, Xiong G, Xiang Y, Ling Y, Khabir A, Tsao GS, Zeng Y, Zeng M, Busson P. </w:t>
+      </w:r>
+      <w:r>
+        <w:rPr>
+          <w:rFonts w:ascii="Calibri" w:hAnsi="Calibri"/>
+          <w:b/>
+          <w:i w:val="0"/>
+          <w:color w:val="17212B"/>
+          <w:sz w:val="18"/>
+        </w:rPr>
+        <w:t>Nasopharyngeal carcinoma super-enhancer-driven ETV6 correlates with prognosis</w:t>
+      </w:r>
+      <w:r>
+        <w:rPr>
+          <w:rFonts w:ascii="Calibri" w:hAnsi="Calibri"/>
+          <w:b w:val="0"/>
+          <w:i w:val="0"/>
+          <w:color w:val="17212B"/>
+          <w:sz w:val="18"/>
+        </w:rPr>
+        <w:t>. Proc Natl Acad Sci U S A. 2017;114(36):9683-9688.</w:t>
       </w:r>
     </w:p>
     <w:p>
@@ -1039,7 +1899,47 @@
           <w:color w:val="17212B"/>
           <w:sz w:val="18"/>
         </w:rPr>
-        <w:t>Liang J, Zhou H, Gerdt C, Tan M, Colson T, Kaye KM, Kieff E, Zhao B. Epstein-Barr virus super-enhancer eRNAs are essential for MYC oncogene expression and lymphoblast proliferation. Proc Natl Acad Sci U S A. 2016;113(49):14121-14126.</w:t>
+        <w:t xml:space="preserve">Liang J, </w:t>
+      </w:r>
+      <w:r>
+        <w:rPr>
+          <w:rFonts w:ascii="Calibri" w:hAnsi="Calibri"/>
+          <w:b/>
+          <w:i w:val="0"/>
+          <w:color w:val="17212B"/>
+          <w:sz w:val="18"/>
+        </w:rPr>
+        <w:t>Zhou H</w:t>
+      </w:r>
+      <w:r>
+        <w:rPr>
+          <w:rFonts w:ascii="Calibri" w:hAnsi="Calibri"/>
+          <w:b w:val="0"/>
+          <w:i w:val="0"/>
+          <w:color w:val="17212B"/>
+          <w:sz w:val="18"/>
+        </w:rPr>
+        <w:t xml:space="preserve">, Gerdt C, Tan M, Colson T, Kaye KM, Kieff E, Zhao B. </w:t>
+      </w:r>
+      <w:r>
+        <w:rPr>
+          <w:rFonts w:ascii="Calibri" w:hAnsi="Calibri"/>
+          <w:b/>
+          <w:i w:val="0"/>
+          <w:color w:val="17212B"/>
+          <w:sz w:val="18"/>
+        </w:rPr>
+        <w:t>Epstein-Barr virus super-enhancer eRNAs are essential for MYC oncogene expression and lymphoblast proliferation</w:t>
+      </w:r>
+      <w:r>
+        <w:rPr>
+          <w:rFonts w:ascii="Calibri" w:hAnsi="Calibri"/>
+          <w:b w:val="0"/>
+          <w:i w:val="0"/>
+          <w:color w:val="17212B"/>
+          <w:sz w:val="18"/>
+        </w:rPr>
+        <w:t>. Proc Natl Acad Sci U S A. 2016;113(49):14121-14126.</w:t>
       </w:r>
     </w:p>
     <w:p>
@@ -1054,7 +1954,92 @@
           <w:color w:val="17212B"/>
           <w:sz w:val="18"/>
         </w:rPr>
-        <w:t>Greenfeld H, Takasaki K, Walsh MJ, Ersing I, Bernhardt K, Ma Y, Fu B, Ashbaugh CW, Cabo J, Mollo SB, Zhou H, Li S, Gewurz BE. TRAF1 coordinates polyubiquitin signaling to enhance EBV LMP1-mediated growth and survival pathway activation. PLoS Pathog. 2015;11(5):e1004890.</w:t>
+        <w:t xml:space="preserve">Greenfeld H, Takasaki K, Walsh MJ, Ersing I, Bernhardt K, Ma Y, Fu B, Ashbaugh CW, Cabo J, Mollo SB, </w:t>
+      </w:r>
+      <w:r>
+        <w:rPr>
+          <w:rFonts w:ascii="Calibri" w:hAnsi="Calibri"/>
+          <w:b/>
+          <w:i w:val="0"/>
+          <w:color w:val="17212B"/>
+          <w:sz w:val="18"/>
+        </w:rPr>
+        <w:t>Zhou H</w:t>
+      </w:r>
+      <w:r>
+        <w:rPr>
+          <w:rFonts w:ascii="Calibri" w:hAnsi="Calibri"/>
+          <w:b w:val="0"/>
+          <w:i w:val="0"/>
+          <w:color w:val="17212B"/>
+          <w:sz w:val="18"/>
+        </w:rPr>
+        <w:t xml:space="preserve">, Li S, Gewurz BE. </w:t>
+      </w:r>
+      <w:r>
+        <w:rPr>
+          <w:rFonts w:ascii="Calibri" w:hAnsi="Calibri"/>
+          <w:b/>
+          <w:i w:val="0"/>
+          <w:color w:val="17212B"/>
+          <w:sz w:val="18"/>
+        </w:rPr>
+        <w:t>TRAF1 coordinates polyubiquitin signaling to enhance EBV LMP1-mediated growth and survival pathway activation</w:t>
+      </w:r>
+      <w:r>
+        <w:rPr>
+          <w:rFonts w:ascii="Calibri" w:hAnsi="Calibri"/>
+          <w:b w:val="0"/>
+          <w:i w:val="0"/>
+          <w:color w:val="17212B"/>
+          <w:sz w:val="18"/>
+        </w:rPr>
+        <w:t>. PLoS Pathog. 2015;11(5):e1004890.</w:t>
+      </w:r>
+    </w:p>
+    <w:p>
+      <w:pPr>
+        <w:pStyle w:val="Publication"/>
+      </w:pPr>
+      <w:r>
+        <w:rPr>
+          <w:rFonts w:ascii="Calibri" w:hAnsi="Calibri"/>
+          <w:b/>
+          <w:i w:val="0"/>
+          <w:color w:val="17212B"/>
+          <w:sz w:val="18"/>
+        </w:rPr>
+        <w:t>Zhou H</w:t>
+      </w:r>
+      <w:r>
+        <w:rPr>
+          <w:rFonts w:ascii="Calibri" w:hAnsi="Calibri"/>
+          <w:b w:val="0"/>
+          <w:i w:val="0"/>
+          <w:color w:val="17212B"/>
+          <w:sz w:val="18"/>
+        </w:rPr>
+        <w:t xml:space="preserve">, Gao S, Nguyen NN, Fan M, Jin J, Liu B, Zhao L, Xiong G, Tan M, Li S, Wong L. </w:t>
+      </w:r>
+      <w:r>
+        <w:rPr>
+          <w:rFonts w:ascii="Calibri" w:hAnsi="Calibri"/>
+          <w:b/>
+          <w:i w:val="0"/>
+          <w:color w:val="17212B"/>
+          <w:sz w:val="18"/>
+        </w:rPr>
+        <w:t>Stringent homology-based prediction of H. sapiens-M. tuberculosis H37Rv protein-protein interactions</w:t>
+      </w:r>
+      <w:r>
+        <w:rPr>
+          <w:rFonts w:ascii="Calibri" w:hAnsi="Calibri"/>
+          <w:b w:val="0"/>
+          <w:i w:val="0"/>
+          <w:color w:val="17212B"/>
+          <w:sz w:val="18"/>
+        </w:rPr>
+        <w:t>. Biol Direct. 2014;9:5.</w:t>
       </w:r>
     </w:p>
     <w:p>
@@ -1069,7 +2054,182 @@
           <w:color w:val="17212B"/>
           <w:sz w:val="18"/>
         </w:rPr>
-        <w:t>Zhou H, Gao S, Nguyen NN, Fan M, Jin J, Liu B, Zhao L, Xiong G, Tan M, Li S, Wong L. Stringent homology-based prediction of H. sapiens-M. tuberculosis H37Rv protein-protein interactions. Biol Direct. 2014;9:5.</w:t>
+        <w:t xml:space="preserve">Fan M, Low HS, </w:t>
+      </w:r>
+      <w:r>
+        <w:rPr>
+          <w:rFonts w:ascii="Calibri" w:hAnsi="Calibri"/>
+          <w:b/>
+          <w:i w:val="0"/>
+          <w:color w:val="17212B"/>
+          <w:sz w:val="18"/>
+        </w:rPr>
+        <w:t>Zhou H</w:t>
+      </w:r>
+      <w:r>
+        <w:rPr>
+          <w:rFonts w:ascii="Calibri" w:hAnsi="Calibri"/>
+          <w:b w:val="0"/>
+          <w:i w:val="0"/>
+          <w:color w:val="17212B"/>
+          <w:sz w:val="18"/>
+        </w:rPr>
+        <w:t xml:space="preserve">, Wenk MR, Wong L. </w:t>
+      </w:r>
+      <w:r>
+        <w:rPr>
+          <w:rFonts w:ascii="Calibri" w:hAnsi="Calibri"/>
+          <w:b/>
+          <w:i w:val="0"/>
+          <w:color w:val="17212B"/>
+          <w:sz w:val="18"/>
+        </w:rPr>
+        <w:t>LipidGO: database for lipid-related GO terms and applications</w:t>
+      </w:r>
+      <w:r>
+        <w:rPr>
+          <w:rFonts w:ascii="Calibri" w:hAnsi="Calibri"/>
+          <w:b w:val="0"/>
+          <w:i w:val="0"/>
+          <w:color w:val="17212B"/>
+          <w:sz w:val="18"/>
+        </w:rPr>
+        <w:t>. Bioinformatics. 2014;30(7):1043-1044.</w:t>
+      </w:r>
+    </w:p>
+    <w:p>
+      <w:pPr>
+        <w:pStyle w:val="Publication"/>
+      </w:pPr>
+      <w:r>
+        <w:rPr>
+          <w:rFonts w:ascii="Calibri" w:hAnsi="Calibri"/>
+          <w:b/>
+          <w:i w:val="0"/>
+          <w:color w:val="17212B"/>
+          <w:sz w:val="18"/>
+        </w:rPr>
+        <w:t>Zhou H</w:t>
+      </w:r>
+      <w:r>
+        <w:rPr>
+          <w:rFonts w:ascii="Calibri" w:hAnsi="Calibri"/>
+          <w:b w:val="0"/>
+          <w:i w:val="0"/>
+          <w:color w:val="17212B"/>
+          <w:sz w:val="18"/>
+        </w:rPr>
+        <w:t xml:space="preserve">, Jin J, Wong L. </w:t>
+      </w:r>
+      <w:r>
+        <w:rPr>
+          <w:rFonts w:ascii="Calibri" w:hAnsi="Calibri"/>
+          <w:b/>
+          <w:i w:val="0"/>
+          <w:color w:val="17212B"/>
+          <w:sz w:val="18"/>
+        </w:rPr>
+        <w:t>Progress in computational studies of host-pathogen interactions</w:t>
+      </w:r>
+      <w:r>
+        <w:rPr>
+          <w:rFonts w:ascii="Calibri" w:hAnsi="Calibri"/>
+          <w:b w:val="0"/>
+          <w:i w:val="0"/>
+          <w:color w:val="17212B"/>
+          <w:sz w:val="18"/>
+        </w:rPr>
+        <w:t>. J Bioinform Comput Biol. 2013;11(2):1230001.</w:t>
+      </w:r>
+    </w:p>
+    <w:p>
+      <w:pPr>
+        <w:pStyle w:val="Publication"/>
+      </w:pPr>
+      <w:r>
+        <w:rPr>
+          <w:rFonts w:ascii="Calibri" w:hAnsi="Calibri"/>
+          <w:b/>
+          <w:i w:val="0"/>
+          <w:color w:val="17212B"/>
+          <w:sz w:val="18"/>
+        </w:rPr>
+        <w:t>Zhou H</w:t>
+      </w:r>
+      <w:r>
+        <w:rPr>
+          <w:rFonts w:ascii="Calibri" w:hAnsi="Calibri"/>
+          <w:b w:val="0"/>
+          <w:i w:val="0"/>
+          <w:color w:val="17212B"/>
+          <w:sz w:val="18"/>
+        </w:rPr>
+        <w:t xml:space="preserve">, Jin J, Zhang H, Yi B, Wozniak M, Wong L. </w:t>
+      </w:r>
+      <w:r>
+        <w:rPr>
+          <w:rFonts w:ascii="Calibri" w:hAnsi="Calibri"/>
+          <w:b/>
+          <w:i w:val="0"/>
+          <w:color w:val="17212B"/>
+          <w:sz w:val="18"/>
+        </w:rPr>
+        <w:t>IntPath: an integrated pathway gene relationship database for model organisms and important pathogens</w:t>
+      </w:r>
+      <w:r>
+        <w:rPr>
+          <w:rFonts w:ascii="Calibri" w:hAnsi="Calibri"/>
+          <w:b w:val="0"/>
+          <w:i w:val="0"/>
+          <w:color w:val="17212B"/>
+          <w:sz w:val="18"/>
+        </w:rPr>
+        <w:t>. BMC Syst Biol. 2012;6 Suppl 2:S2.</w:t>
+      </w:r>
+    </w:p>
+    <w:p>
+      <w:pPr>
+        <w:pStyle w:val="Publication"/>
+      </w:pPr>
+      <w:r>
+        <w:rPr>
+          <w:rFonts w:ascii="Calibri" w:hAnsi="Calibri"/>
+          <w:b/>
+          <w:i w:val="0"/>
+          <w:color w:val="17212B"/>
+          <w:sz w:val="18"/>
+        </w:rPr>
+        <w:t>Zhou H</w:t>
+      </w:r>
+      <w:r>
+        <w:rPr>
+          <w:rFonts w:ascii="Calibri" w:hAnsi="Calibri"/>
+          <w:b w:val="0"/>
+          <w:i w:val="0"/>
+          <w:color w:val="17212B"/>
+          <w:sz w:val="18"/>
+        </w:rPr>
+        <w:t xml:space="preserve">, Wong L. </w:t>
+      </w:r>
+      <w:r>
+        <w:rPr>
+          <w:rFonts w:ascii="Calibri" w:hAnsi="Calibri"/>
+          <w:b/>
+          <w:i w:val="0"/>
+          <w:color w:val="17212B"/>
+          <w:sz w:val="18"/>
+        </w:rPr>
+        <w:t>Comparative analysis and assessment of M. tuberculosis H37Rv protein-protein interaction datasets</w:t>
+      </w:r>
+      <w:r>
+        <w:rPr>
+          <w:rFonts w:ascii="Calibri" w:hAnsi="Calibri"/>
+          <w:b w:val="0"/>
+          <w:i w:val="0"/>
+          <w:color w:val="17212B"/>
+          <w:sz w:val="18"/>
+        </w:rPr>
+        <w:t>. BMC Genomics. 2011;12 Suppl 3:S20.</w:t>
       </w:r>
     </w:p>
     <w:p>
@@ -1084,13 +2244,18 @@
           <w:color w:val="17212B"/>
           <w:sz w:val="18"/>
         </w:rPr>
-        <w:t>Fan M, Low HS, Zhou H, Wenk MR, Wong L. LipidGO: database for lipid-related GO terms and applications. Bioinformatics. 2014;30(7):1043-1044.</w:t>
+        <w:t xml:space="preserve">Xie Q, Jin H, Luo R, Wan Y, Chu J, </w:t>
       </w:r>
-    </w:p>
-    <w:p>
-      <w:pPr>
-        <w:pStyle w:val="Publication"/>
-      </w:pPr>
+      <w:r>
+        <w:rPr>
+          <w:rFonts w:ascii="Calibri" w:hAnsi="Calibri"/>
+          <w:b/>
+          <w:i w:val="0"/>
+          <w:color w:val="17212B"/>
+          <w:sz w:val="18"/>
+        </w:rPr>
+        <w:t>Zhou H</w:t>
+      </w:r>
       <w:r>
         <w:rPr>
           <w:rFonts w:ascii="Calibri" w:hAnsi="Calibri"/>
@@ -1099,13 +2264,18 @@
           <w:color w:val="17212B"/>
           <w:sz w:val="18"/>
         </w:rPr>
-        <w:t>Zhou H, Jin J, Wong L. Progress in computational studies of host-pathogen interactions. J Bioinform Comput Biol. 2013;11(2):1230001.</w:t>
+        <w:t xml:space="preserve">, Shi B, Chen H, Zhou R. </w:t>
       </w:r>
-    </w:p>
-    <w:p>
-      <w:pPr>
-        <w:pStyle w:val="Publication"/>
-      </w:pPr>
+      <w:r>
+        <w:rPr>
+          <w:rFonts w:ascii="Calibri" w:hAnsi="Calibri"/>
+          <w:b/>
+          <w:i w:val="0"/>
+          <w:color w:val="17212B"/>
+          <w:sz w:val="18"/>
+        </w:rPr>
+        <w:t>Transcriptional responses of Haemophilus parasuis to iron-restriction stress in vitro</w:t>
+      </w:r>
       <w:r>
         <w:rPr>
           <w:rFonts w:ascii="Calibri" w:hAnsi="Calibri"/>
@@ -1114,37 +2284,7 @@
           <w:color w:val="17212B"/>
           <w:sz w:val="18"/>
         </w:rPr>
-        <w:t>Zhou H, Jin J, Zhang H, Yi B, Wozniak M, Wong L. IntPath: an integrated pathway gene relationship database for model organisms and important pathogens. BMC Syst Biol. 2012;6 Suppl 2:S2.</w:t>
-      </w:r>
-    </w:p>
-    <w:p>
-      <w:pPr>
-        <w:pStyle w:val="Publication"/>
-      </w:pPr>
-      <w:r>
-        <w:rPr>
-          <w:rFonts w:ascii="Calibri" w:hAnsi="Calibri"/>
-          <w:b w:val="0"/>
-          <w:i w:val="0"/>
-          <w:color w:val="17212B"/>
-          <w:sz w:val="18"/>
-        </w:rPr>
-        <w:t>Zhou H, Wong L. Comparative analysis and assessment of M. tuberculosis H37Rv protein-protein interaction datasets. BMC Genomics. 2011;12 Suppl 3:S20.</w:t>
-      </w:r>
-    </w:p>
-    <w:p>
-      <w:pPr>
-        <w:pStyle w:val="Publication"/>
-      </w:pPr>
-      <w:r>
-        <w:rPr>
-          <w:rFonts w:ascii="Calibri" w:hAnsi="Calibri"/>
-          <w:b w:val="0"/>
-          <w:i w:val="0"/>
-          <w:color w:val="17212B"/>
-          <w:sz w:val="18"/>
-        </w:rPr>
-        <w:t>Xie Q, Jin H, Luo R, Wan Y, Chu J, Zhou H, Shi B, Chen H, Zhou R. Transcriptional responses of Haemophilus parasuis to iron-restriction stress in vitro. Biometals. 2009;22(6):907-916.</w:t>
+        <w:t>. Biometals. 2009;22(6):907-916.</w:t>
       </w:r>
     </w:p>
     <w:p>
@@ -1168,12 +2308,42 @@
       <w:r>
         <w:rPr>
           <w:rFonts w:ascii="Calibri" w:hAnsi="Calibri"/>
+          <w:b/>
+          <w:i w:val="0"/>
+          <w:color w:val="17212B"/>
+          <w:sz w:val="18"/>
+        </w:rPr>
+        <w:t>Zhou H</w:t>
+      </w:r>
+      <w:r>
+        <w:rPr>
+          <w:rFonts w:ascii="Calibri" w:hAnsi="Calibri"/>
           <w:b w:val="0"/>
           <w:i w:val="0"/>
           <w:color w:val="17212B"/>
           <w:sz w:val="18"/>
         </w:rPr>
-        <w:t>Zhou H, Jiang S, Colditz G. Digital pathology image analysis enhances 10-year risk stratification for early-stage ER+ breast cancer. ASHG Annual Meeting Poster. 2024.</w:t>
+        <w:t xml:space="preserve">, Jiang S, Colditz G. </w:t>
+      </w:r>
+      <w:r>
+        <w:rPr>
+          <w:rFonts w:ascii="Calibri" w:hAnsi="Calibri"/>
+          <w:b/>
+          <w:i w:val="0"/>
+          <w:color w:val="17212B"/>
+          <w:sz w:val="18"/>
+        </w:rPr>
+        <w:t>Digital pathology image analysis enhances 10-year risk stratification for early-stage ER+ breast cancer</w:t>
+      </w:r>
+      <w:r>
+        <w:rPr>
+          <w:rFonts w:ascii="Calibri" w:hAnsi="Calibri"/>
+          <w:b w:val="0"/>
+          <w:i w:val="0"/>
+          <w:color w:val="17212B"/>
+          <w:sz w:val="18"/>
+        </w:rPr>
+        <w:t>. ASHG Annual Meeting Poster. 2024.</w:t>
       </w:r>
     </w:p>
     <w:sectPr>

</xml_diff>